<commit_message>
updated some remaining issues one the PCB
</commit_message>
<xml_diff>
--- a/AM Receiver/PCB_Design_-_Review_Template_V1.11_filled_designer_review.docx
+++ b/AM Receiver/PCB_Design_-_Review_Template_V1.11_filled_designer_review.docx
@@ -1304,10 +1304,6 @@
             </w:pPr>
             <w:r>
               <w:rPr/>
-              <w:t xml:space="preserve"> </w:t>
-            </w:r>
-            <w:r>
-              <w:rPr/>
               <w:t>Legacy-Bauteile TDA1072AT/SFZ455A bleiben Beschaffungsrisiko ohne einfachen Drop-in-Ersatz.</w:t>
             </w:r>
           </w:p>
@@ -4144,7 +4140,7 @@
             </w:pPr>
             <w:r>
               <w:rPr/>
-              <w:t>Stecker sind erreichbar; der zuvor offene C131/TP115-Courtyardkonflikt ist behoben und DRC-clean.</w:t>
+              <w:t>Stecker sind erreichbar.</w:t>
             </w:r>
           </w:p>
         </w:tc>
@@ -6720,7 +6716,7 @@
             </w:pPr>
             <w:r>
               <w:rPr/>
-              <w:t>GND-Flaeche und Rueckstrompfade sind DRC-seitig sauber; der vorige C131-Zonenfehler ist behoben.</w:t>
+              <w:t>GND-Flaeche und Rueckstrompfade sind DRC-seitig sauber</w:t>
             </w:r>
           </w:p>
         </w:tc>

</xml_diff>